<commit_message>
Fix: save images in /static/uploads; add images in ODT/ODX
</commit_message>
<xml_diff>
--- a/documents/01.docx
+++ b/documents/01.docx
@@ -4,279 +4,54 @@
   <w:body>
     <w:p>
       <w:r>
-        <w:t xml:space="preserve">01 </w:t>
+        <w:rPr>
+          <w:shd w:fill="F1C40F"/>
+        </w:rPr>
+        <w:t xml:space="preserve">documento </w:t>
       </w:r>
       <w:r>
-        <w:rPr>
-          <w:highlight w:val="green"/>
-          <w:shd w:fill="BFEDD2"/>
-        </w:rPr>
-        <w:t>Light green</w:t>
+        <w:t xml:space="preserve">con imagenes. </w:t>
       </w:r>
     </w:p>
-    <w:p/>
     <w:p>
       <w:r>
-        <w:t xml:space="preserve">02 </w:t>
-      </w:r>
-      <w:r>
-        <w:rPr>
-          <w:highlight w:val="yellow"/>
-          <w:shd w:fill="FBEEB8"/>
-        </w:rPr>
-        <w:t>Ligh yellow</w:t>
+        <w:drawing>
+          <wp:inline xmlns:a="http://schemas.openxmlformats.org/drawingml/2006/main" xmlns:pic="http://schemas.openxmlformats.org/drawingml/2006/picture">
+            <wp:extent cx="5651500" cy="3492500"/>
+            <wp:docPr id="1" name="Picture 1"/>
+            <wp:cNvGraphicFramePr>
+              <a:graphicFrameLocks noChangeAspect="1"/>
+            </wp:cNvGraphicFramePr>
+            <a:graphic>
+              <a:graphicData uri="http://schemas.openxmlformats.org/drawingml/2006/picture">
+                <pic:pic>
+                  <pic:nvPicPr>
+                    <pic:cNvPr id="0" name="db0ef98435b94adf9a8375767c23bea0.png"/>
+                    <pic:cNvPicPr/>
+                  </pic:nvPicPr>
+                  <pic:blipFill>
+                    <a:blip r:embed="rId9"/>
+                    <a:stretch>
+                      <a:fillRect/>
+                    </a:stretch>
+                  </pic:blipFill>
+                  <pic:spPr>
+                    <a:xfrm>
+                      <a:off x="0" y="0"/>
+                      <a:ext cx="5651500" cy="3492500"/>
+                    </a:xfrm>
+                    <a:prstGeom prst="rect"/>
+                  </pic:spPr>
+                </pic:pic>
+              </a:graphicData>
+            </a:graphic>
+          </wp:inline>
+        </w:drawing>
       </w:r>
     </w:p>
-    <w:p/>
     <w:p>
       <w:r>
-        <w:t>coler</w:t>
-      </w:r>
-      <w:r>
-        <w:t xml:space="preserve"> </w:t>
-      </w:r>
-      <w:r>
-        <w:rPr>
-          <w:highlight w:val="magenta"/>
-          <w:shd w:fill="F8CAC6"/>
-        </w:rPr>
-        <w:t>03 Light red</w:t>
-      </w:r>
-    </w:p>
-    <w:p/>
-    <w:p>
-      <w:r>
-        <w:t>color</w:t>
-      </w:r>
-      <w:r>
-        <w:t xml:space="preserve"> </w:t>
-      </w:r>
-      <w:r>
-        <w:rPr>
-          <w:highlight w:val="lightGray"/>
-          <w:shd w:fill="ECCAFA"/>
-        </w:rPr>
-        <w:t>04 Light purple</w:t>
-      </w:r>
-    </w:p>
-    <w:p/>
-    <w:p>
-      <w:r>
-        <w:rPr>
-          <w:b/>
-        </w:rPr>
-        <w:t>color</w:t>
-      </w:r>
-      <w:r>
-        <w:t xml:space="preserve"> </w:t>
-      </w:r>
-      <w:r>
-        <w:rPr>
-          <w:highlight w:val="cyan"/>
-          <w:shd w:fill="C2E0F4"/>
-        </w:rPr>
-        <w:t>05 Light blue</w:t>
-      </w:r>
-    </w:p>
-    <w:p/>
-    <w:p>
-      <w:r>
-        <w:rPr>
-          <w:i/>
-        </w:rPr>
-        <w:t>color</w:t>
-      </w:r>
-      <w:r>
-        <w:t xml:space="preserve"> </w:t>
-      </w:r>
-      <w:r>
-        <w:rPr>
-          <w:highlight w:val="darkGreen"/>
-          <w:shd w:fill="2DC26B"/>
-        </w:rPr>
-        <w:t>06 green</w:t>
-      </w:r>
-    </w:p>
-    <w:p/>
-    <w:p>
-      <w:r>
-        <w:t xml:space="preserve">color </w:t>
-      </w:r>
-      <w:r>
-        <w:rPr>
-          <w:highlight w:val="red"/>
-          <w:shd w:fill="F1C40F"/>
-        </w:rPr>
-        <w:t>07 yellow</w:t>
-      </w:r>
-    </w:p>
-    <w:p/>
-    <w:p>
-      <w:r>
-        <w:t xml:space="preserve">color </w:t>
-      </w:r>
-      <w:r>
-        <w:rPr>
-          <w:highlight w:val="red"/>
-          <w:shd w:fill="E03E2D"/>
-        </w:rPr>
-        <w:t>08 red</w:t>
-      </w:r>
-    </w:p>
-    <w:p/>
-    <w:p>
-      <w:r>
-        <w:t xml:space="preserve">color </w:t>
-      </w:r>
-      <w:r>
-        <w:rPr>
-          <w:highlight w:val="darkGray"/>
-          <w:shd w:fill="B96AD9"/>
-        </w:rPr>
-        <w:t>09 purrple</w:t>
-      </w:r>
-    </w:p>
-    <w:p/>
-    <w:p>
-      <w:r>
-        <w:t xml:space="preserve">color </w:t>
-      </w:r>
-      <w:r>
-        <w:rPr>
-          <w:highlight w:val="blue"/>
-          <w:shd w:fill="3598DB"/>
-        </w:rPr>
-        <w:t xml:space="preserve"> 10 blue</w:t>
-      </w:r>
-    </w:p>
-    <w:p/>
-    <w:p>
-      <w:r>
-        <w:t>color</w:t>
-      </w:r>
-      <w:r>
-        <w:rPr>
-          <w:highlight w:val="darkCyan"/>
-          <w:shd w:fill="169179"/>
-        </w:rPr>
-        <w:t xml:space="preserve"> 11 dark tourquosie</w:t>
-      </w:r>
-    </w:p>
-    <w:p/>
-    <w:p>
-      <w:r>
-        <w:t xml:space="preserve">color </w:t>
-      </w:r>
-      <w:r>
-        <w:rPr>
-          <w:highlight w:val="red"/>
-          <w:shd w:fill="E67E23"/>
-        </w:rPr>
-        <w:t>12 organge</w:t>
-      </w:r>
-    </w:p>
-    <w:p/>
-    <w:p>
-      <w:r>
-        <w:t xml:space="preserve">color </w:t>
-      </w:r>
-      <w:r>
-        <w:rPr>
-          <w:highlight w:val="red"/>
-          <w:shd w:fill="BA372A"/>
-        </w:rPr>
-        <w:t>13  dark red</w:t>
-      </w:r>
-    </w:p>
-    <w:p/>
-    <w:p>
-      <w:r>
-        <w:t xml:space="preserve">color </w:t>
-      </w:r>
-      <w:r>
-        <w:rPr>
-          <w:highlight w:val="darkGray"/>
-          <w:shd w:fill="843FA1"/>
-        </w:rPr>
-        <w:t>14 dark purple</w:t>
-      </w:r>
-    </w:p>
-    <w:p/>
-    <w:p>
-      <w:r>
-        <w:t xml:space="preserve">color </w:t>
-      </w:r>
-      <w:r>
-        <w:rPr>
-          <w:highlight w:val="darkCyan"/>
-          <w:shd w:fill="236FA1"/>
-        </w:rPr>
-        <w:t xml:space="preserve">15 dark blue </w:t>
-      </w:r>
-    </w:p>
-    <w:p/>
-    <w:p>
-      <w:r>
-        <w:t xml:space="preserve">color </w:t>
-      </w:r>
-      <w:r>
-        <w:rPr>
-          <w:highlight w:val="lightGray"/>
-          <w:shd w:fill="ECF0F1"/>
-        </w:rPr>
-        <w:t>16 light gray</w:t>
-      </w:r>
-    </w:p>
-    <w:p/>
-    <w:p>
-      <w:r>
-        <w:t xml:space="preserve">color </w:t>
-      </w:r>
-      <w:r>
-        <w:rPr>
-          <w:highlight w:val="green"/>
-          <w:shd w:fill="CED4D9"/>
-        </w:rPr>
-        <w:t>17 medium gray</w:t>
-      </w:r>
-    </w:p>
-    <w:p/>
-    <w:p>
-      <w:r>
-        <w:t xml:space="preserve">color </w:t>
-      </w:r>
-      <w:r>
-        <w:rPr>
-          <w:highlight w:val="darkGray"/>
-          <w:shd w:fill="95A5A6"/>
-        </w:rPr>
-        <w:t>18 gray</w:t>
-      </w:r>
-    </w:p>
-    <w:p/>
-    <w:p>
-      <w:r>
-        <w:t xml:space="preserve">color </w:t>
-      </w:r>
-      <w:r>
-        <w:rPr>
-          <w:highlight w:val="darkGray"/>
-          <w:shd w:fill="7E8C8D"/>
-        </w:rPr>
-        <w:t>19 dark gray</w:t>
-      </w:r>
-    </w:p>
-    <w:p/>
-    <w:p>
-      <w:r>
-        <w:t xml:space="preserve">color </w:t>
-      </w:r>
-      <w:r>
-        <w:rPr>
-          <w:highlight w:val="darkCyan"/>
-          <w:shd w:fill="34495E"/>
-        </w:rPr>
-        <w:t xml:space="preserve">20 navy blue </w:t>
+        <w:t>veremos.</w:t>
       </w:r>
     </w:p>
     <w:p/>

</xml_diff>